<commit_message>
Update docs — verify and fill gaps in architecture and indexing reference
Architecture Guide:
- Added section 7a: Critical Fixes Applied (manifest 3-stage commit, HNSW K=25,
  image-only stubs, blended scoring, reference deduplication)
- Added section 7b: SMS RAG QA Fixes (History 422, MCQ formatting, _Toc dedup,
  [Section Name] placeholder, keyword boost, cross-client isolation)

Indexing Commands Reference:
- Fixed Python path: anaconda3 → .conda (correct conda env location)
- Added section 4a: Unified Indexer for PDF/DOCX via LlamaParse v2
- Added section 8: Re-indexing priority order for all 12 clients

Co-Authored-By: Claude Opus 4.6 <noreply@anthropic.com>
</commit_message>
<xml_diff>
--- a/docs/SMS_RAG_Architecture_Guide.docx
+++ b/docs/SMS_RAG_Architecture_Guide.docx
@@ -7514,6 +7514,96 @@
       </w:pPr>
     </w:p>
     <w:p>
+      <w:r>
+        <w:t xml:space="preserve"/>
+      </w:r>
+    </w:p>
+    <w:p>
+      <w:r>
+        <w:t xml:space="preserve">7a. Critical Fixes Applied</w:t>
+      </w:r>
+    </w:p>
+    <w:p>
+      <w:r>
+        <w:t xml:space="preserve"/>
+      </w:r>
+    </w:p>
+    <w:p>
+      <w:r>
+        <w:t xml:space="preserve">Manifest 3-Stage Commit: Chunks are written to ChromaDB in 3 stages: (1) chunk text, (2) embed vectors, (3) confirm presence in ChromaDB before writing to manifest.json. This prevents silent data loss if embedding fails mid-batch.</w:t>
+      </w:r>
+    </w:p>
+    <w:p>
+      <w:r>
+        <w:t xml:space="preserve">HNSW K=25 Permanent Fix: ChromaDB uses HNSW approximate nearest neighbor search. After SCP transfer of new chroma data, HNSW indices may not find recently added chunks with small K values. Setting INITIAL_RETRIEVE_K=25 (instead of default 10) ensures new chunks are always found. This is set permanently in /opt/sms-rag/.env.</w:t>
+      </w:r>
+    </w:p>
+    <w:p>
+      <w:r>
+        <w:t xml:space="preserve">Image-Only Stub Handling: Documents that contain only images (no extractable text) get a stub chunk with metadata stub=True. This ensures they appear in the manifest and audit reports as accounted for, rather than showing as missing.</w:t>
+      </w:r>
+    </w:p>
+    <w:p>
+      <w:r>
+        <w:t xml:space="preserve">Blended Scoring: Final chunk scores use 65% reranker score + 35% retriever score. This balances semantic relevance (reranker) with vector similarity (retriever) for better results.</w:t>
+      </w:r>
+    </w:p>
+    <w:p>
+      <w:r>
+        <w:t xml:space="preserve">Reference Deduplication: References are deduped by slug_url, score-normalized to 0-1 range, filtered with min threshold 0.25, and hard-capped at 8 references per answer.</w:t>
+      </w:r>
+    </w:p>
+    <w:p>
+      <w:r>
+        <w:t xml:space="preserve"/>
+      </w:r>
+    </w:p>
+    <w:p>
+      <w:r>
+        <w:t xml:space="preserve">7b. SMS RAG QA Fixes</w:t>
+      </w:r>
+    </w:p>
+    <w:p>
+      <w:r>
+        <w:t xml:space="preserve"/>
+      </w:r>
+    </w:p>
+    <w:p>
+      <w:r>
+        <w:t xml:space="preserve">History 422 Fix: The /history endpoint returned HTTP 422 when conversation_id was missing from the query string. Fixed by making conversation_id optional (returns empty list if missing).</w:t>
+      </w:r>
+    </w:p>
+    <w:p>
+      <w:r>
+        <w:t xml:space="preserve">MCQ Formatting Fix: Multiple-choice questions in synthesized answers were not rendering correctly. Fixed markdown formatting in the synthesis prompt to ensure proper list rendering.</w:t>
+      </w:r>
+    </w:p>
+    <w:p>
+      <w:r>
+        <w:t xml:space="preserve">_Toc Dedup Fix: Breadcrumb titles contained machine-generated IDs like _Toc12345 or Section 00001. Added _clean_title() filter that strips these IDs, numeric-only strings, and other machine artifacts from display titles.</w:t>
+      </w:r>
+    </w:p>
+    <w:p>
+      <w:r>
+        <w:t xml:space="preserve">[Section Name] Placeholder Fix: Some breadcrumbs showed raw [Section Name] placeholder text instead of the actual heading. Fixed by falling back to the section_title metadata field when breadcrumb parsing fails.</w:t>
+      </w:r>
+    </w:p>
+    <w:p>
+      <w:r>
+        <w:t xml:space="preserve">Keyword Boost: Added keyword matching boost to retrieval scoring — chunks containing exact query terms get a score bonus, improving results for specific technical terms.</w:t>
+      </w:r>
+    </w:p>
+    <w:p>
+      <w:r>
+        <w:t xml:space="preserve">Cross-Client Isolation: The DELETE /conversations/{id} endpoint now enforces client_id isolation — a request from client A cannot delete conversations belonging to client B.</w:t>
+      </w:r>
+    </w:p>
+    <w:p>
+      <w:r>
+        <w:t xml:space="preserve"/>
+      </w:r>
+    </w:p>
+    <w:p>
       <w:pPr>
         <w:pBdr>
           <w:bottom w:val="single" w:color="1F3864" w:sz="8" w:space="4"/>
@@ -7521,15 +7611,7 @@
         <w:spacing w:after="80" w:before="300"/>
       </w:pPr>
       <w:r>
-        <w:rPr>
-          <w:rFonts w:ascii="Calibri" w:cs="Calibri" w:eastAsia="Calibri" w:hAnsi="Calibri"/>
-          <w:b/>
-          <w:bCs/>
-          <w:color w:val="1F3864"/>
-          <w:sz w:val="32"/>
-          <w:szCs w:val="32"/>
-        </w:rPr>
-        <w:t xml:space="preserve">8. Adding a New Client — Step by Step</w:t>
+        <w:t>9. Adding a New Client — Step by Step</w:t>
       </w:r>
     </w:p>
     <w:p>
@@ -8181,15 +8263,7 @@
         <w:spacing w:after="80" w:before="300"/>
       </w:pPr>
       <w:r>
-        <w:rPr>
-          <w:rFonts w:ascii="Calibri" w:cs="Calibri" w:eastAsia="Calibri" w:hAnsi="Calibri"/>
-          <w:b/>
-          <w:bCs/>
-          <w:color w:val="1F3864"/>
-          <w:sz w:val="32"/>
-          <w:szCs w:val="32"/>
-        </w:rPr>
-        <w:t xml:space="preserve">9. GitHub Repository</w:t>
+        <w:t>10. GitHub Repository</w:t>
       </w:r>
     </w:p>
     <w:tbl>
@@ -8616,15 +8690,7 @@
         <w:spacing w:after="80" w:before="300"/>
       </w:pPr>
       <w:r>
-        <w:rPr>
-          <w:rFonts w:ascii="Calibri" w:cs="Calibri" w:eastAsia="Calibri" w:hAnsi="Calibri"/>
-          <w:b/>
-          <w:bCs/>
-          <w:color w:val="1F3864"/>
-          <w:sz w:val="32"/>
-          <w:szCs w:val="32"/>
-        </w:rPr>
-        <w:t xml:space="preserve">10. Key People and Contacts</w:t>
+        <w:t>11. Key People and Contacts</w:t>
       </w:r>
     </w:p>
     <w:tbl>

</xml_diff>